<commit_message>
Correct inline formatting in complete SOC handbook Q1-124
</commit_message>
<xml_diff>
--- a/SOC_Analyst_Interview_Preparation_Handbook.docx
+++ b/SOC_Analyst_Interview_Preparation_Handbook.docx
@@ -15,7 +15,7 @@
         <w:pStyle w:val="Subtitle"/>
       </w:pPr>
       <w:r>
-        <w:t xml:space="preserve">Verified daily curriculum • Questions 1–124 • 17 August–8 October 2026</w:t>
+        <w:t xml:space="preserve">Questions 1–124 | 17 August–8 October 2026 | Canonical GitHub compilation</w:t>
       </w:r>
     </w:p>
     <w:p>
@@ -23,31 +23,31 @@
         <w:pStyle w:val="Heading1"/>
       </w:pPr>
       <w:r>
-        <w:t xml:space="preserve">Purpose and usage</w:t>
-      </w:r>
-    </w:p>
-    <w:p>
-      <w:pPr>
-        <w:pStyle w:val="Normal"/>
-      </w:pPr>
-      <w:r>
-        <w:t xml:space="preserve">This handbook consolidates all canonical daily SOC Tier 1 interview practice entries from the Cartsoptions/SOC-Interview-Practice GitHub repository, in chronological order. It preserves the complete question sets, real-world scenarios, Tier 1 checks, tools/logs, interview takeaways, verification notes and market-research notes as recorded in those entries.</w:t>
-      </w:r>
-    </w:p>
-    <w:p>
-      <w:pPr>
-        <w:pStyle w:val="Normal"/>
-      </w:pPr>
-      <w:r>
-        <w:t xml:space="preserve">Evidence discipline: distinguish observation, hypothesis and confirmed evidence; do not claim production experience beyond documented training; follow organisational playbooks and assigned authority for response actions.</w:t>
-      </w:r>
-    </w:p>
-    <w:p>
-      <w:pPr>
-        <w:pStyle w:val="Normal"/>
-      </w:pPr>
-      <w:r>
-        <w:t xml:space="preserve">Source of truth: https://github.com/Cartsoptions/SOC-Interview-Practice/tree/main/daily</w:t>
+        <w:t xml:space="preserve">Introduction</w:t>
+      </w:r>
+    </w:p>
+    <w:p>
+      <w:pPr>
+        <w:pStyle w:val="Normal"/>
+      </w:pPr>
+      <w:r>
+        <w:t xml:space="preserve">This handbook consolidates all 38 daily SOC Tier 1 interview practice entries from Cartsoptions/SOC-Interview-Practice. The complete verified question texts, realistic scenarios, Tier 1 investigation checks, tools/logs, takeaways, verification notes and market research notes are preserved in chronological order.</w:t>
+      </w:r>
+    </w:p>
+    <w:p>
+      <w:pPr>
+        <w:pStyle w:val="Normal"/>
+      </w:pPr>
+      <w:r>
+        <w:t xml:space="preserve">When preparing interview answers, distinguish observation, hypothesis and confirmed evidence. Do not claim production work beyond documented training. Follow organisational playbooks and assigned authority for incident-response actions.</w:t>
+      </w:r>
+    </w:p>
+    <w:p>
+      <w:pPr>
+        <w:pStyle w:val="Normal"/>
+      </w:pPr>
+      <w:r>
+        <w:t xml:space="preserve">Canonical source: https://github.com/Cartsoptions/SOC-Interview-Practice/tree/main/daily</w:t>
       </w:r>
     </w:p>
     <w:p>
@@ -56,7 +56,7 @@
         <w:pageBreakBefore/>
       </w:pPr>
       <w:r>
-        <w:t xml:space="preserve">Canonical daily entries</w:t>
+        <w:t xml:space="preserve">Daily interview questions</w:t>
       </w:r>
     </w:p>
     <w:p>
@@ -3387,7 +3387,7 @@
           <w:rFonts w:ascii="Consolas" w:hAnsi="Consolas"/>
           <w:sz w:val="17"/>
         </w:rPr>
-        <w:t xml:space="preserve">uthentication-Results`</w:t>
+        <w:t xml:space="preserve">Authentication-Results</w:t>
       </w:r>
       <w:r>
         <w:t xml:space="preserve"> and relevant message-header evidence</w:t>
@@ -3926,7 +3926,7 @@
           <w:rFonts w:ascii="Consolas" w:hAnsi="Consolas"/>
           <w:sz w:val="17"/>
         </w:rPr>
-        <w:t xml:space="preserve">uthentication-Results`</w:t>
+        <w:t xml:space="preserve">Authentication-Results</w:t>
       </w:r>
       <w:r>
         <w:t xml:space="preserve">, SPF/DKIM/DMARC results, composite authentication and message-header analysis during troubleshooting/investigation.</w:t>
@@ -5295,7 +5295,7 @@
           <w:rFonts w:ascii="Consolas" w:hAnsi="Consolas"/>
           <w:sz w:val="17"/>
         </w:rPr>
-        <w:t xml:space="preserve">undll32.exe`</w:t>
+        <w:t xml:space="preserve">rundll32.exe</w:t>
       </w:r>
       <w:r>
         <w:t xml:space="preserve"> executing on a user workstation. The filename alone is not enough because </w:t>
@@ -5305,7 +5305,7 @@
           <w:rFonts w:ascii="Consolas" w:hAnsi="Consolas"/>
           <w:sz w:val="17"/>
         </w:rPr>
-        <w:t xml:space="preserve">undll32.exe`</w:t>
+        <w:t xml:space="preserve">rundll32.exe</w:t>
       </w:r>
       <w:r>
         <w:t xml:space="preserve"> is a legitimate Windows component. I would inspect Event 4688 and/or Sysmon Event 1 for the executable path, parent process, user, process identifiers and command line where available. If the parent is an Office application, the command line references an unusual DLL from a user-writable directory, and subsequent telemetry shows an external connection, the combined behaviour is more suspicious than </w:t>
@@ -5315,7 +5315,7 @@
           <w:rFonts w:ascii="Consolas" w:hAnsi="Consolas"/>
           <w:sz w:val="17"/>
         </w:rPr>
-        <w:t xml:space="preserve">undll32.exe`</w:t>
+        <w:t xml:space="preserve">rundll32.exe</w:t>
       </w:r>
       <w:r>
         <w:t xml:space="preserve"> by itself.</w:t>
@@ -6206,7 +6206,7 @@
           <w:rFonts w:ascii="Consolas" w:hAnsi="Consolas"/>
           <w:sz w:val="17"/>
         </w:rPr>
-        <w:t xml:space="preserve">udo`</w:t>
+        <w:t xml:space="preserve">sudo</w:t>
       </w:r>
       <w:r>
         <w:t xml:space="preserve">/privilege activity, process execution, file changes and outbound network connections. MITRE ATT&amp;CK maps adversarial use of SSH for remote access/lateral movement to </w:t>
@@ -6233,7 +6233,7 @@
           <w:rFonts w:ascii="Consolas" w:hAnsi="Consolas"/>
           <w:sz w:val="17"/>
         </w:rPr>
-        <w:t xml:space="preserve">shd`</w:t>
+        <w:t xml:space="preserve">sshd</w:t>
       </w:r>
       <w:r>
         <w:t xml:space="preserve"> policy or blocking an address would follow the organisation's response authority and playbook.</w:t>
@@ -6260,7 +6260,7 @@
           <w:rFonts w:ascii="Consolas" w:hAnsi="Consolas"/>
           <w:sz w:val="17"/>
         </w:rPr>
-        <w:t xml:space="preserve">udo`</w:t>
+        <w:t xml:space="preserve">sudo</w:t>
       </w:r>
       <w:r>
         <w:t xml:space="preserve"> use, new persistence, file downloads or outbound connections, I would escalate as possible account compromise. If the source belongs to an approved administrator and the failures were caused by a known key/password issue, that may explain the pattern.</w:t>
@@ -6335,7 +6335,7 @@
           <w:rFonts w:ascii="Consolas" w:hAnsi="Consolas"/>
           <w:sz w:val="17"/>
         </w:rPr>
-        <w:t xml:space="preserve">udo`</w:t>
+        <w:t xml:space="preserve">sudo</w:t>
       </w:r>
       <w:r>
         <w:t xml:space="preserve">/privilege escalation and session activity after login</w:t>
@@ -6394,7 +6394,7 @@
           <w:rFonts w:ascii="Consolas" w:hAnsi="Consolas"/>
           <w:sz w:val="17"/>
         </w:rPr>
-        <w:t xml:space="preserve">var/log/auth.log`</w:t>
+        <w:t xml:space="preserve">/var/log/auth.log</w:t>
       </w:r>
       <w:r>
         <w:t xml:space="preserve"> where applicable; systemd journal where configured; Wazuh, Splunk or Microsoft Sentinel; EDR/XDR for Linux where deployed; firewall/network telemetry; SSH server logs; change-management and ticketing records.</w:t>
@@ -6697,7 +6697,7 @@
           <w:rFonts w:ascii="Consolas" w:hAnsi="Consolas"/>
           <w:sz w:val="17"/>
         </w:rPr>
-        <w:t xml:space="preserve">var/log/auth.log`</w:t>
+        <w:t xml:space="preserve">/var/log/auth.log</w:t>
       </w:r>
       <w:r>
         <w:t xml:space="preserve"> as an authentication troubleshooting source. Exact Linux logging locations vary by distribution and configuration; systemd-based systems may also expose service logs through the journal.</w:t>
@@ -6813,7 +6813,7 @@
           <w:rFonts w:ascii="Consolas" w:hAnsi="Consolas"/>
           <w:sz w:val="17"/>
         </w:rPr>
-        <w:t xml:space="preserve">var/log/auth.log`</w:t>
+        <w:t xml:space="preserve">/var/log/auth.log</w:t>
       </w:r>
       <w:r>
         <w:t xml:space="preserve">: https://ubuntu.com/server/docs/</w:t>
@@ -7164,7 +7164,7 @@
           <w:rFonts w:ascii="Consolas" w:hAnsi="Consolas"/>
           <w:sz w:val="17"/>
         </w:rPr>
-        <w:t xml:space="preserve">ttp`</w:t>
+        <w:t xml:space="preserve">http</w:t>
       </w:r>
       <w:r>
         <w:t xml:space="preserve"> and </w:t>
@@ -7174,7 +7174,7 @@
           <w:rFonts w:ascii="Consolas" w:hAnsi="Consolas"/>
           <w:sz w:val="17"/>
         </w:rPr>
-        <w:t xml:space="preserve">ttps`</w:t>
+        <w:t xml:space="preserve">https</w:t>
       </w:r>
       <w:r>
         <w:t xml:space="preserve"> URI schemes. HTTPS uses HTTP semantics over a connection that the client must secure before sending requests for an </w:t>
@@ -7184,7 +7184,7 @@
           <w:rFonts w:ascii="Consolas" w:hAnsi="Consolas"/>
           <w:sz w:val="17"/>
         </w:rPr>
-        <w:t xml:space="preserve">ttps`</w:t>
+        <w:t xml:space="preserve">https</w:t>
       </w:r>
       <w:r>
         <w:t xml:space="preserve"> resource.</w:t>
@@ -7210,7 +7210,7 @@
           <w:rFonts w:ascii="Consolas" w:hAnsi="Consolas"/>
           <w:sz w:val="17"/>
         </w:rPr>
-        <w:t xml:space="preserve">ONNECT`</w:t>
+        <w:t xml:space="preserve">CONNECT</w:t>
       </w:r>
       <w:r>
         <w:t xml:space="preserve"> method, I would not assume it can see the full encrypted request path or payload. I would therefore correlate proxy evidence with DNS, firewall and EDR process/network telemetry.</w:t>
@@ -7682,7 +7682,7 @@
           <w:rFonts w:ascii="Consolas" w:hAnsi="Consolas"/>
           <w:sz w:val="17"/>
         </w:rPr>
-        <w:t xml:space="preserve">hreatIntelIndicators`</w:t>
+        <w:t xml:space="preserve">ThreatIntelIndicators</w:t>
       </w:r>
       <w:r>
         <w:t xml:space="preserve"> and </w:t>
@@ -7692,7 +7692,7 @@
           <w:rFonts w:ascii="Consolas" w:hAnsi="Consolas"/>
           <w:sz w:val="17"/>
         </w:rPr>
-        <w:t xml:space="preserve">hreatIntelObjects`</w:t>
+        <w:t xml:space="preserve">ThreatIntelObjects</w:t>
       </w:r>
       <w:r>
         <w:t xml:space="preserve">; the legacy </w:t>
@@ -7702,7 +7702,7 @@
           <w:rFonts w:ascii="Consolas" w:hAnsi="Consolas"/>
           <w:sz w:val="17"/>
         </w:rPr>
-        <w:t xml:space="preserve">hreatIntelligenceIndicator`</w:t>
+        <w:t xml:space="preserve">ThreatIntelligenceIndicator</w:t>
       </w:r>
       <w:r>
         <w:t xml:space="preserve"> ingestion path ended in 2025. This matters when discussing current Sentinel implementations, although an interview answer should focus on the investigation concept rather than memorising a table name.</w:t>
@@ -7720,7 +7720,7 @@
           <w:rFonts w:ascii="Consolas" w:hAnsi="Consolas"/>
           <w:sz w:val="17"/>
         </w:rPr>
-        <w:t xml:space="preserve">ttp`</w:t>
+        <w:t xml:space="preserve">http</w:t>
       </w:r>
       <w:r>
         <w:t xml:space="preserve"> and </w:t>
@@ -7730,7 +7730,7 @@
           <w:rFonts w:ascii="Consolas" w:hAnsi="Consolas"/>
           <w:sz w:val="17"/>
         </w:rPr>
-        <w:t xml:space="preserve">ttps`</w:t>
+        <w:t xml:space="preserve">https</w:t>
       </w:r>
       <w:r>
         <w:t xml:space="preserve"> URI schemes. For an </w:t>
@@ -7740,7 +7740,7 @@
           <w:rFonts w:ascii="Consolas" w:hAnsi="Consolas"/>
           <w:sz w:val="17"/>
         </w:rPr>
-        <w:t xml:space="preserve">ttps`</w:t>
+        <w:t xml:space="preserve">https</w:t>
       </w:r>
       <w:r>
         <w:t xml:space="preserve"> resource, the client must secure the connection before sending the HTTP request.</w:t>
@@ -7997,7 +7997,7 @@
           <w:rFonts w:ascii="Consolas" w:hAnsi="Consolas"/>
           <w:sz w:val="17"/>
         </w:rPr>
-        <w:t xml:space="preserve">here`</w:t>
+        <w:t xml:space="preserve">where</w:t>
       </w:r>
       <w:r>
         <w:t xml:space="preserve">, </w:t>
@@ -8007,7 +8007,7 @@
           <w:rFonts w:ascii="Consolas" w:hAnsi="Consolas"/>
           <w:sz w:val="17"/>
         </w:rPr>
-        <w:t xml:space="preserve">roject`</w:t>
+        <w:t xml:space="preserve">project</w:t>
       </w:r>
       <w:r>
         <w:t xml:space="preserve">, </w:t>
@@ -8017,7 +8017,7 @@
           <w:rFonts w:ascii="Consolas" w:hAnsi="Consolas"/>
           <w:sz w:val="17"/>
         </w:rPr>
-        <w:t xml:space="preserve">xtend`</w:t>
+        <w:t xml:space="preserve">extend</w:t>
       </w:r>
       <w:r>
         <w:t xml:space="preserve">, </w:t>
@@ -8027,7 +8027,7 @@
           <w:rFonts w:ascii="Consolas" w:hAnsi="Consolas"/>
           <w:sz w:val="17"/>
         </w:rPr>
-        <w:t xml:space="preserve">ummarize`</w:t>
+        <w:t xml:space="preserve">summarize</w:t>
       </w:r>
       <w:r>
         <w:t xml:space="preserve">, </w:t>
@@ -8037,7 +8037,7 @@
           <w:rFonts w:ascii="Consolas" w:hAnsi="Consolas"/>
           <w:sz w:val="17"/>
         </w:rPr>
-        <w:t xml:space="preserve">rder by`</w:t>
+        <w:t xml:space="preserve">order by</w:t>
       </w:r>
       <w:r>
         <w:t xml:space="preserve"> and </w:t>
@@ -8047,7 +8047,7 @@
           <w:rFonts w:ascii="Consolas" w:hAnsi="Consolas"/>
           <w:sz w:val="17"/>
         </w:rPr>
-        <w:t xml:space="preserve">oin`</w:t>
+        <w:t xml:space="preserve">join</w:t>
       </w:r>
       <w:r>
         <w:t xml:space="preserve"> can help structure that analysis, but exact table and field names depend on the connected data source and schema. I would therefore inspect the actual table schema instead of inventing fields.</w:t>
@@ -8527,7 +8527,7 @@
           <w:rFonts w:ascii="Consolas" w:hAnsi="Consolas"/>
           <w:sz w:val="17"/>
         </w:rPr>
-        <w:t xml:space="preserve">AIL FROM`</w:t>
+        <w:t xml:space="preserve">MAIL FROM</w:t>
       </w:r>
       <w:r>
         <w:t xml:space="preserve"> value as the sender for trace searches even when the visible From or Reply-To values differ. That makes message trace useful for confirming delivery and routing, but it should be correlated with full message headers and the Defender for Office 365 email investigation evidence where available.</w:t>
@@ -8595,7 +8595,7 @@
           <w:rFonts w:ascii="Consolas" w:hAnsi="Consolas"/>
           <w:sz w:val="17"/>
         </w:rPr>
-        <w:t xml:space="preserve">AIL FROM`</w:t>
+        <w:t xml:space="preserve">MAIL FROM</w:t>
       </w:r>
       <w:r>
         <w:t xml:space="preserve">/envelope sender where available</w:t>
@@ -8800,7 +8800,7 @@
           <w:rFonts w:ascii="Consolas" w:hAnsi="Consolas"/>
           <w:sz w:val="17"/>
         </w:rPr>
-        <w:t xml:space="preserve">AIL FROM`</w:t>
+        <w:t xml:space="preserve">MAIL FROM</w:t>
       </w:r>
       <w:r>
         <w:t xml:space="preserve"> value as the sender in trace searches regardless of different visible From/Reply-To values.</w:t>
@@ -9059,7 +9059,7 @@
           <w:rFonts w:ascii="Consolas" w:hAnsi="Consolas"/>
           <w:sz w:val="17"/>
         </w:rPr>
-        <w:t xml:space="preserve">onsent to application`</w:t>
+        <w:t xml:space="preserve">Consent to application</w:t>
       </w:r>
       <w:r>
         <w:t xml:space="preserve">, </w:t>
@@ -9069,7 +9069,7 @@
           <w:rFonts w:ascii="Consolas" w:hAnsi="Consolas"/>
           <w:sz w:val="17"/>
         </w:rPr>
-        <w:t xml:space="preserve">dd delegated permission grant`</w:t>
+        <w:t xml:space="preserve">Add delegated permission grant</w:t>
       </w:r>
       <w:r>
         <w:t xml:space="preserve">, and app-role assignment activity for application permissions. Where Defender for Cloud Apps/App Governance is licensed and enabled, I would also review the app's publisher/origin, requested permissions, users who authorised it, risk/anomaly information and subsequent application activity.</w:t>
@@ -9169,7 +9169,7 @@
           <w:rFonts w:ascii="Consolas" w:hAnsi="Consolas"/>
           <w:sz w:val="17"/>
         </w:rPr>
-        <w:t xml:space="preserve">onsent to application`</w:t>
+        <w:t xml:space="preserve">Consent to application</w:t>
       </w:r>
       <w:r>
         <w:t xml:space="preserve"> or delegated/app-role permission grants</w:t>
@@ -9888,7 +9888,7 @@
           <w:rFonts w:ascii="Consolas" w:hAnsi="Consolas"/>
           <w:sz w:val="17"/>
         </w:rPr>
-        <w:t xml:space="preserve">onsent to application`</w:t>
+        <w:t xml:space="preserve">Consent to application</w:t>
       </w:r>
       <w:r>
         <w:t xml:space="preserve">, </w:t>
@@ -9898,7 +9898,7 @@
           <w:rFonts w:ascii="Consolas" w:hAnsi="Consolas"/>
           <w:sz w:val="17"/>
         </w:rPr>
-        <w:t xml:space="preserve">dd delegated permission grant`</w:t>
+        <w:t xml:space="preserve">Add delegated permission grant</w:t>
       </w:r>
       <w:r>
         <w:t xml:space="preserve">, and application-role assignment events for service principals.</w:t>
@@ -9940,7 +9940,7 @@
           <w:rFonts w:ascii="Consolas" w:hAnsi="Consolas"/>
           <w:sz w:val="17"/>
         </w:rPr>
-        <w:t xml:space="preserve"> scheduled task was created`</w:t>
+        <w:t xml:space="preserve">A scheduled task was created</w:t>
       </w:r>
       <w:r>
         <w:t xml:space="preserve"> and lists Subject, Task Name and Task Content among its investigation fields. The Audit Other Object Access Events subcategory also includes 4699, 4700, 4701 and 4702 for scheduled-task lifecycle changes.</w:t>
@@ -15305,7 +15305,7 @@
           <w:rFonts w:ascii="Consolas" w:hAnsi="Consolas"/>
           <w:sz w:val="17"/>
         </w:rPr>
-        <w:t xml:space="preserve">ehaviorAnalytics`</w:t>
+        <w:t xml:space="preserve">BehaviorAnalytics</w:t>
       </w:r>
       <w:r>
         <w:t xml:space="preserve"> and </w:t>
@@ -15315,7 +15315,7 @@
           <w:rFonts w:ascii="Consolas" w:hAnsi="Consolas"/>
           <w:sz w:val="17"/>
         </w:rPr>
-        <w:t xml:space="preserve">ehaviorInfo`</w:t>
+        <w:t xml:space="preserve">BehaviorInfo</w:t>
       </w:r>
       <w:r>
         <w:t xml:space="preserve">, and identity enrichment in </w:t>
@@ -15325,7 +15325,7 @@
           <w:rFonts w:ascii="Consolas" w:hAnsi="Consolas"/>
           <w:sz w:val="17"/>
         </w:rPr>
-        <w:t xml:space="preserve">dentityInfo`</w:t>
+        <w:t xml:space="preserve">IdentityInfo</w:t>
       </w:r>
       <w:r>
         <w:t xml:space="preserve">. Exact fields and data depend on enabled connectors and workspace configuration, so I would inspect the real schema rather than assume every environment has the same data.</w:t>
@@ -15576,7 +15576,7 @@
           <w:rFonts w:ascii="Consolas" w:hAnsi="Consolas"/>
           <w:sz w:val="17"/>
         </w:rPr>
-        <w:t xml:space="preserve">ehaviorAnalytics`</w:t>
+        <w:t xml:space="preserve">BehaviorAnalytics</w:t>
       </w:r>
       <w:r>
         <w:t xml:space="preserve">, </w:t>
@@ -15586,7 +15586,7 @@
           <w:rFonts w:ascii="Consolas" w:hAnsi="Consolas"/>
           <w:sz w:val="17"/>
         </w:rPr>
-        <w:t xml:space="preserve">ehaviorInfo`</w:t>
+        <w:t xml:space="preserve">BehaviorInfo</w:t>
       </w:r>
       <w:r>
         <w:t xml:space="preserve"> and </w:t>
@@ -15596,7 +15596,7 @@
           <w:rFonts w:ascii="Consolas" w:hAnsi="Consolas"/>
           <w:sz w:val="17"/>
         </w:rPr>
-        <w:t xml:space="preserve">dentityInfo`</w:t>
+        <w:t xml:space="preserve">IdentityInfo</w:t>
       </w:r>
       <w:r>
         <w:t xml:space="preserve"> where available; Microsoft Entra sign-ins; Defender XDR/Endpoint; Defender for Cloud Apps; Microsoft 365 audit logs; firewall/DNS/proxy/VPN telemetry; incident-management records.</w:t>
@@ -15691,7 +15691,7 @@
           <w:rFonts w:ascii="Consolas" w:hAnsi="Consolas"/>
           <w:sz w:val="17"/>
         </w:rPr>
-        <w:t xml:space="preserve">orrelationId`</w:t>
+        <w:t xml:space="preserve">CorrelationId</w:t>
       </w:r>
       <w:r>
         <w:t xml:space="preserve"> values.</w:t>
@@ -15717,7 +15717,7 @@
           <w:rFonts w:ascii="Consolas" w:hAnsi="Consolas"/>
           <w:sz w:val="17"/>
         </w:rPr>
-        <w:t xml:space="preserve">ehaviorAnalytics`</w:t>
+        <w:t xml:space="preserve">BehaviorAnalytics</w:t>
       </w:r>
       <w:r>
         <w:t xml:space="preserve"> and </w:t>
@@ -15727,7 +15727,7 @@
           <w:rFonts w:ascii="Consolas" w:hAnsi="Consolas"/>
           <w:sz w:val="17"/>
         </w:rPr>
-        <w:t xml:space="preserve">ehaviorInfo`</w:t>
+        <w:t xml:space="preserve">BehaviorInfo</w:t>
       </w:r>
       <w:r>
         <w:t xml:space="preserve">; </w:t>
@@ -15737,7 +15737,7 @@
           <w:rFonts w:ascii="Consolas" w:hAnsi="Consolas"/>
           <w:sz w:val="17"/>
         </w:rPr>
-        <w:t xml:space="preserve">dentityInfo`</w:t>
+        <w:t xml:space="preserve">IdentityInfo</w:t>
       </w:r>
       <w:r>
         <w:t xml:space="preserve"> stores identity information used for enrichment. Actual data depends on enabled connectors and workspace configuration.</w:t>
@@ -15955,7 +15955,7 @@
           <w:rFonts w:ascii="Consolas" w:hAnsi="Consolas"/>
           <w:sz w:val="17"/>
         </w:rPr>
-        <w:t xml:space="preserve">undll32.exe`</w:t>
+        <w:t xml:space="preserve">rundll32.exe</w:t>
       </w:r>
       <w:r>
         <w:t xml:space="preserve"> or </w:t>
@@ -15965,7 +15965,7 @@
           <w:rFonts w:ascii="Consolas" w:hAnsi="Consolas"/>
           <w:sz w:val="17"/>
         </w:rPr>
-        <w:t xml:space="preserve">egsvr32.exe`</w:t>
+        <w:t xml:space="preserve">regsvr32.exe</w:t>
       </w:r>
       <w:r>
         <w:t xml:space="preserve"> being used in suspicious activity?</w:t>
@@ -15992,7 +15992,7 @@
           <w:rFonts w:ascii="Consolas" w:hAnsi="Consolas"/>
           <w:sz w:val="17"/>
         </w:rPr>
-        <w:t xml:space="preserve">undll32.exe`</w:t>
+        <w:t xml:space="preserve">rundll32.exe</w:t>
       </w:r>
       <w:r>
         <w:t xml:space="preserve">, </w:t>
@@ -16002,7 +16002,7 @@
           <w:rFonts w:ascii="Consolas" w:hAnsi="Consolas"/>
           <w:sz w:val="17"/>
         </w:rPr>
-        <w:t xml:space="preserve">egsvr32.exe`</w:t>
+        <w:t xml:space="preserve">regsvr32.exe</w:t>
       </w:r>
       <w:r>
         <w:t xml:space="preserve">, </w:t>
@@ -16012,7 +16012,7 @@
           <w:rFonts w:ascii="Consolas" w:hAnsi="Consolas"/>
           <w:sz w:val="17"/>
         </w:rPr>
-        <w:t xml:space="preserve">siexec.exe`</w:t>
+        <w:t xml:space="preserve">msiexec.exe</w:t>
       </w:r>
       <w:r>
         <w:t xml:space="preserve"> and others can be used legitimately by Windows and administrators, but attackers can also abuse them to proxy execution of malicious code.</w:t>
@@ -16167,7 +16167,7 @@
           <w:rFonts w:ascii="Consolas" w:hAnsi="Consolas"/>
           <w:sz w:val="17"/>
         </w:rPr>
-        <w:t xml:space="preserve">undll32.exe`</w:t>
+        <w:t xml:space="preserve">rundll32.exe</w:t>
       </w:r>
       <w:r>
         <w:t xml:space="preserve"> may be being abused as a proxy for malicious execution.</w:t>
@@ -16356,7 +16356,7 @@
           <w:rFonts w:ascii="Consolas" w:hAnsi="Consolas"/>
           <w:sz w:val="17"/>
         </w:rPr>
-        <w:t xml:space="preserve">undll32.exe`</w:t>
+        <w:t xml:space="preserve">rundll32.exe</w:t>
       </w:r>
       <w:r>
         <w:t xml:space="preserve">, </w:t>
@@ -16366,7 +16366,7 @@
           <w:rFonts w:ascii="Consolas" w:hAnsi="Consolas"/>
           <w:sz w:val="17"/>
         </w:rPr>
-        <w:t xml:space="preserve">egsvr32.exe`</w:t>
+        <w:t xml:space="preserve">regsvr32.exe</w:t>
       </w:r>
       <w:r>
         <w:t xml:space="preserve"> or another signed binary by its name alone; I would investigate the parent-child chain, command line, loaded file, signer/hash, network activity and follow-on behaviour before escalating suspected living-off-the-land execution.</w:t>
@@ -16402,7 +16402,7 @@
           <w:rFonts w:ascii="Consolas" w:hAnsi="Consolas"/>
           <w:sz w:val="17"/>
         </w:rPr>
-        <w:t xml:space="preserve">sass.exe`</w:t>
+        <w:t xml:space="preserve">lsass.exe</w:t>
       </w:r>
       <w:r>
         <w:t xml:space="preserve"> memory without assuming every LSASS access is malicious?</w:t>
@@ -16452,7 +16452,7 @@
           <w:rFonts w:ascii="Consolas" w:hAnsi="Consolas"/>
           <w:sz w:val="17"/>
         </w:rPr>
-        <w:t xml:space="preserve">sass.exe`</w:t>
+        <w:t xml:space="preserve">lsass.exe</w:t>
       </w:r>
       <w:r>
         <w:t xml:space="preserve"> followed by memory dumping, dump-file creation or other credential-scraping behaviour.</w:t>
@@ -16651,7 +16651,7 @@
           <w:rFonts w:ascii="Consolas" w:hAnsi="Consolas"/>
           <w:sz w:val="17"/>
         </w:rPr>
-        <w:t xml:space="preserve">sass.exe`</w:t>
+        <w:t xml:space="preserve">lsass.exe</w:t>
       </w:r>
     </w:p>
     <w:p>
@@ -17399,7 +17399,7 @@
           <w:rFonts w:ascii="Consolas" w:hAnsi="Consolas"/>
           <w:sz w:val="17"/>
         </w:rPr>
-        <w:t xml:space="preserve">undll32.exe`</w:t>
+        <w:t xml:space="preserve">rundll32.exe</w:t>
       </w:r>
       <w:r>
         <w:t xml:space="preserve">, </w:t>
@@ -17409,7 +17409,7 @@
           <w:rFonts w:ascii="Consolas" w:hAnsi="Consolas"/>
           <w:sz w:val="17"/>
         </w:rPr>
-        <w:t xml:space="preserve">siexec.exe`</w:t>
+        <w:t xml:space="preserve">msiexec.exe</w:t>
       </w:r>
       <w:r>
         <w:t xml:space="preserve"> or </w:t>
@@ -17419,7 +17419,7 @@
           <w:rFonts w:ascii="Consolas" w:hAnsi="Consolas"/>
           <w:sz w:val="17"/>
         </w:rPr>
-        <w:t xml:space="preserve">egsvr32.exe`</w:t>
+        <w:t xml:space="preserve">regsvr32.exe</w:t>
       </w:r>
       <w:r>
         <w:t xml:space="preserve"> executing suspicious payloads, unusual command lines/modules and network activity.</w:t>
@@ -22397,7 +22397,7 @@
           <w:rFonts w:ascii="Consolas" w:hAnsi="Consolas"/>
           <w:sz w:val="17"/>
         </w:rPr>
-        <w:t xml:space="preserve">eDebugPrivilege`</w:t>
+        <w:t xml:space="preserve">SeDebugPrivilege</w:t>
       </w:r>
       <w:r>
         <w:t xml:space="preserve">, </w:t>
@@ -22407,7 +22407,7 @@
           <w:rFonts w:ascii="Consolas" w:hAnsi="Consolas"/>
           <w:sz w:val="17"/>
         </w:rPr>
-        <w:t xml:space="preserve">eBackupPrivilege`</w:t>
+        <w:t xml:space="preserve">SeBackupPrivilege</w:t>
       </w:r>
       <w:r>
         <w:t xml:space="preserve">, </w:t>
@@ -22417,7 +22417,7 @@
           <w:rFonts w:ascii="Consolas" w:hAnsi="Consolas"/>
           <w:sz w:val="17"/>
         </w:rPr>
-        <w:t xml:space="preserve">eImpersonatePrivilege`</w:t>
+        <w:t xml:space="preserve">SeImpersonatePrivilege</w:t>
       </w:r>
       <w:r>
         <w:t xml:space="preserve">, </w:t>
@@ -22427,7 +22427,7 @@
           <w:rFonts w:ascii="Consolas" w:hAnsi="Consolas"/>
           <w:sz w:val="17"/>
         </w:rPr>
-        <w:t xml:space="preserve">eLoadDriverPrivilege`</w:t>
+        <w:t xml:space="preserve">SeLoadDriverPrivilege</w:t>
       </w:r>
       <w:r>
         <w:t xml:space="preserve"> and others.</w:t>
@@ -22560,7 +22560,7 @@
           <w:rFonts w:ascii="Consolas" w:hAnsi="Consolas"/>
           <w:sz w:val="17"/>
         </w:rPr>
-        <w:t xml:space="preserve">eDebugPrivilege`</w:t>
+        <w:t xml:space="preserve">SeDebugPrivilege</w:t>
       </w:r>
       <w:r>
         <w:t xml:space="preserve"> and </w:t>
@@ -22570,7 +22570,7 @@
           <w:rFonts w:ascii="Consolas" w:hAnsi="Consolas"/>
           <w:sz w:val="17"/>
         </w:rPr>
-        <w:t xml:space="preserve">eImpersonatePrivilege`</w:t>
+        <w:t xml:space="preserve">SeImpersonatePrivilege</w:t>
       </w:r>
       <w:r>
         <w:t xml:space="preserve">.</w:t>
@@ -22843,7 +22843,7 @@
           <w:rFonts w:ascii="Consolas" w:hAnsi="Consolas"/>
           <w:sz w:val="17"/>
         </w:rPr>
-        <w:t xml:space="preserve">owershell.exe`</w:t>
+        <w:t xml:space="preserve">powershell.exe</w:t>
       </w:r>
       <w:r>
         <w:t xml:space="preserve"> or </w:t>
@@ -22853,7 +22853,7 @@
           <w:rFonts w:ascii="Consolas" w:hAnsi="Consolas"/>
           <w:sz w:val="17"/>
         </w:rPr>
-        <w:t xml:space="preserve">wsh.exe`</w:t>
+        <w:t xml:space="preserve">pwsh.exe</w:t>
       </w:r>
       <w:r>
         <w:t xml:space="preserve"> using </w:t>
@@ -22863,7 +22863,7 @@
           <w:rFonts w:ascii="Consolas" w:hAnsi="Consolas"/>
           <w:sz w:val="17"/>
         </w:rPr>
-        <w:t xml:space="preserve">EncodedCommand`</w:t>
+        <w:t xml:space="preserve">-EncodedCommand</w:t>
       </w:r>
       <w:r>
         <w:t xml:space="preserve">. What does that mean, and how would you investigate encoded or obfuscated PowerShell without assuming that Base64 encoding is automatically malicious?</w:t>
@@ -22896,7 +22896,7 @@
           <w:rFonts w:ascii="Consolas" w:hAnsi="Consolas"/>
           <w:sz w:val="17"/>
         </w:rPr>
-        <w:t xml:space="preserve">wsh`</w:t>
+        <w:t xml:space="preserve">pwsh</w:t>
       </w:r>
       <w:r>
         <w:t xml:space="preserve">, the encoded command is represented as Base64 over a UTF-16LE command string.</w:t>
@@ -22988,7 +22988,7 @@
           <w:rFonts w:ascii="Consolas" w:hAnsi="Consolas"/>
           <w:sz w:val="17"/>
         </w:rPr>
-        <w:t xml:space="preserve">icrosoft-Windows-PowerShell/Operational`</w:t>
+        <w:t xml:space="preserve">Microsoft-Windows-PowerShell/Operational</w:t>
       </w:r>
       <w:r>
         <w:t xml:space="preserve"> log. Script Block Logging records the content of script blocks processed by PowerShell and can therefore provide much better visibility than the encoded command line alone. Logging coverage must be verified because this policy is not something I would assume is enabled everywhere.</w:t>
@@ -23006,7 +23006,7 @@
           <w:rFonts w:ascii="Consolas" w:hAnsi="Consolas"/>
           <w:sz w:val="17"/>
         </w:rPr>
-        <w:t xml:space="preserve">eviceProcessEvents`</w:t>
+        <w:t xml:space="preserve">DeviceProcessEvents</w:t>
       </w:r>
       <w:r>
         <w:t xml:space="preserve"> table contains process-creation telemetry and fields such as </w:t>
@@ -23016,7 +23016,7 @@
           <w:rFonts w:ascii="Consolas" w:hAnsi="Consolas"/>
           <w:sz w:val="17"/>
         </w:rPr>
-        <w:t xml:space="preserve">rocessCommandLine`</w:t>
+        <w:t xml:space="preserve">ProcessCommandLine</w:t>
       </w:r>
       <w:r>
         <w:t xml:space="preserve"> when Defender for Endpoint supplies the data. I would use the actual available schema rather than assume every environment has identical telemetry.</w:t>
@@ -23145,7 +23145,7 @@
           <w:rFonts w:ascii="Consolas" w:hAnsi="Consolas"/>
           <w:sz w:val="17"/>
         </w:rPr>
-        <w:t xml:space="preserve">owershell.exe`</w:t>
+        <w:t xml:space="preserve">powershell.exe</w:t>
       </w:r>
       <w:r>
         <w:t xml:space="preserve"> versus </w:t>
@@ -23155,7 +23155,7 @@
           <w:rFonts w:ascii="Consolas" w:hAnsi="Consolas"/>
           <w:sz w:val="17"/>
         </w:rPr>
-        <w:t xml:space="preserve">wsh.exe`</w:t>
+        <w:t xml:space="preserve">pwsh.exe</w:t>
       </w:r>
     </w:p>
     <w:p>
@@ -23186,7 +23186,7 @@
           <w:rFonts w:ascii="Consolas" w:hAnsi="Consolas"/>
           <w:sz w:val="17"/>
         </w:rPr>
-        <w:t xml:space="preserve">EncodedCommand`</w:t>
+        <w:t xml:space="preserve">-EncodedCommand</w:t>
       </w:r>
       <w:r>
         <w:t xml:space="preserve"> or another obfuscation technique is present</w:t>
@@ -23236,7 +23236,7 @@
           <w:rFonts w:ascii="Consolas" w:hAnsi="Consolas"/>
           <w:sz w:val="17"/>
         </w:rPr>
-        <w:t xml:space="preserve">eviceProcessEvents`</w:t>
+        <w:t xml:space="preserve">DeviceProcessEvents</w:t>
       </w:r>
       <w:r>
         <w:t xml:space="preserve"> process telemetry where available</w:t>
@@ -23349,7 +23349,7 @@
           <w:rFonts w:ascii="Consolas" w:hAnsi="Consolas"/>
           <w:sz w:val="17"/>
         </w:rPr>
-        <w:t xml:space="preserve">EncodedCommand`</w:t>
+        <w:t xml:space="preserve">-EncodedCommand</w:t>
       </w:r>
       <w:r>
         <w:t xml:space="preserve"> means PowerShell received a Base64-encoded command. It is not automatically malicious and Base64 is not encryption. I would inspect the parent process, safely decode the content without executing it, check Script Block Logging or EDR process telemetry and correlate files, persistence and network behaviour before deciding whether the PowerShell activity is malicious.</w:t>
@@ -23411,7 +23411,7 @@
           <w:rFonts w:ascii="Consolas" w:hAnsi="Consolas"/>
           <w:sz w:val="17"/>
         </w:rPr>
-        <w:t xml:space="preserve">pecial privileges assigned to new logon`</w:t>
+        <w:t xml:space="preserve">Special privileges assigned to new logon</w:t>
       </w:r>
       <w:r>
         <w:t xml:space="preserve">. The event is generated when sensitive privileges are assigned to a new logon session and includes a Logon ID that can be correlated with events such as </w:t>
@@ -23446,7 +23446,7 @@
           <w:rFonts w:ascii="Consolas" w:hAnsi="Consolas"/>
           <w:sz w:val="17"/>
         </w:rPr>
-        <w:t xml:space="preserve">wsh`</w:t>
+        <w:t xml:space="preserve">pwsh</w:t>
       </w:r>
       <w:r>
         <w:t xml:space="preserve"> support </w:t>
@@ -23482,7 +23482,7 @@
           <w:rFonts w:ascii="Consolas" w:hAnsi="Consolas"/>
           <w:sz w:val="17"/>
         </w:rPr>
-        <w:t xml:space="preserve">icrosoft-Windows-PowerShell/Operational`</w:t>
+        <w:t xml:space="preserve">Microsoft-Windows-PowerShell/Operational</w:t>
       </w:r>
       <w:r>
         <w:t xml:space="preserve"> log when Script Block Logging is enabled. The policy records the content of processed script blocks.</w:t>
@@ -23526,7 +23526,7 @@
           <w:rFonts w:ascii="Consolas" w:hAnsi="Consolas"/>
           <w:sz w:val="17"/>
         </w:rPr>
-        <w:t xml:space="preserve">eviceProcessEvents`</w:t>
+        <w:t xml:space="preserve">DeviceProcessEvents</w:t>
       </w:r>
       <w:r>
         <w:t xml:space="preserve"> as process-creation telemetry populated by Defender for Endpoint and includes fields such as </w:t>
@@ -23536,7 +23536,7 @@
           <w:rFonts w:ascii="Consolas" w:hAnsi="Consolas"/>
           <w:sz w:val="17"/>
         </w:rPr>
-        <w:t xml:space="preserve">rocessCommandLine`</w:t>
+        <w:t xml:space="preserve">ProcessCommandLine</w:t>
       </w:r>
       <w:r>
         <w:t xml:space="preserve">. Exact records and fields available in an investigation depend on deployed services and telemetry coverage.</w:t>
@@ -23920,7 +23920,7 @@
           <w:rFonts w:ascii="Consolas" w:hAnsi="Consolas"/>
           <w:sz w:val="17"/>
         </w:rPr>
-        <w:t xml:space="preserve">vc-backup2`</w:t>
+        <w:t xml:space="preserve">svc-backup2</w:t>
       </w:r>
       <w:r>
         <w:t xml:space="preserve">.</w:t>
@@ -24974,7 +24974,7 @@
           <w:rFonts w:ascii="Consolas" w:hAnsi="Consolas"/>
           <w:sz w:val="17"/>
         </w:rPr>
-        <w:t xml:space="preserve"> user account was created`</w:t>
+        <w:t xml:space="preserve">A user account was created</w:t>
       </w:r>
       <w:r>
         <w:t xml:space="preserve">; it is generated when a new user object is created on domain controllers, member servers and workstations.</w:t>
@@ -31952,7 +31952,7 @@
           <w:rFonts w:ascii="Consolas" w:hAnsi="Consolas"/>
           <w:sz w:val="17"/>
         </w:rPr>
-        <w:t xml:space="preserve">ecurityEvent`</w:t>
+        <w:t xml:space="preserve">SecurityEvent</w:t>
       </w:r>
       <w:r>
         <w:t xml:space="preserve"> is the table being queried. </w:t>
@@ -31962,7 +31962,7 @@
           <w:rFonts w:ascii="Consolas" w:hAnsi="Consolas"/>
           <w:sz w:val="17"/>
         </w:rPr>
-        <w:t xml:space="preserve">here EventID == 4625`</w:t>
+        <w:t xml:space="preserve">where EventID == 4625</w:t>
       </w:r>
       <w:r>
         <w:t xml:space="preserve"> keeps Windows failed-logon events. </w:t>
@@ -31972,7 +31972,7 @@
           <w:rFonts w:ascii="Consolas" w:hAnsi="Consolas"/>
           <w:sz w:val="17"/>
         </w:rPr>
-        <w:t xml:space="preserve">ummarize FailedLogons=count() by TargetAccount, Computer`</w:t>
+        <w:t xml:space="preserve">summarize FailedLogons=count() by TargetAccount, Computer</w:t>
       </w:r>
       <w:r>
         <w:t xml:space="preserve"> counts those events for each account/computer combination. The final </w:t>
@@ -31982,7 +31982,7 @@
           <w:rFonts w:ascii="Consolas" w:hAnsi="Consolas"/>
           <w:sz w:val="17"/>
         </w:rPr>
-        <w:t xml:space="preserve">here`</w:t>
+        <w:t xml:space="preserve">where</w:t>
       </w:r>
       <w:r>
         <w:t xml:space="preserve"> keeps combinations with more than ten failures.</w:t>
@@ -32000,7 +32000,7 @@
           <w:rFonts w:ascii="Consolas" w:hAnsi="Consolas"/>
           <w:sz w:val="17"/>
         </w:rPr>
-        <w:t xml:space="preserve">ecurityEvent | where EventID == 4625 | summarize count() by TargetAccount, Computer, _ResourceId`</w:t>
+        <w:t xml:space="preserve">SecurityEvent | where EventID == 4625 | summarize count() by TargetAccount, Computer, _ResourceId</w:t>
       </w:r>
       <w:r>
         <w:t xml:space="preserve"> to report Windows failed logins, so the core table/Event ID/operator usage is supported by Microsoft documentation.</w:t>
@@ -32043,7 +32043,7 @@
           <w:rFonts w:ascii="Consolas" w:hAnsi="Consolas"/>
           <w:sz w:val="17"/>
         </w:rPr>
-        <w:t xml:space="preserve">vc_backup`</w:t>
+        <w:t xml:space="preserve">svc_backup</w:t>
       </w:r>
       <w:r>
         <w:t xml:space="preserve"> on </w:t>
@@ -32053,7 +32053,7 @@
           <w:rFonts w:ascii="Consolas" w:hAnsi="Consolas"/>
           <w:sz w:val="17"/>
         </w:rPr>
-        <w:t xml:space="preserve">ERVER01`</w:t>
+        <w:t xml:space="preserve">SERVER01</w:t>
       </w:r>
       <w:r>
         <w:t xml:space="preserve"> with 240 failures. Rather than immediately escalating it as brute force, I inspect the raw 4625 events. If they occur exactly once per minute from a known backup server after a password rotation, stale credentials become a strong hypothesis. If failures arrive rapidly from an unexpected workstation against several privileged accounts and one later succeeds, attack likelihood rises sharply.</w:t>
@@ -32169,7 +32169,7 @@
           <w:rFonts w:ascii="Consolas" w:hAnsi="Consolas"/>
           <w:sz w:val="17"/>
         </w:rPr>
-        <w:t xml:space="preserve">ecurityEvent`</w:t>
+        <w:t xml:space="preserve">SecurityEvent</w:t>
       </w:r>
       <w:r>
         <w:t xml:space="preserve">, Windows Security logs, Defender for Endpoint, identity/VPN and firewall telemetry.</w:t>
@@ -32280,7 +32280,7 @@
           <w:rFonts w:ascii="Consolas" w:hAnsi="Consolas"/>
           <w:sz w:val="17"/>
         </w:rPr>
-        <w:t xml:space="preserve">eviceNetworkEvents`</w:t>
+        <w:t xml:space="preserve">DeviceNetworkEvents</w:t>
       </w:r>
       <w:r>
         <w:t xml:space="preserve"> contains network-connection telemetry and </w:t>
@@ -32290,7 +32290,7 @@
           <w:rFonts w:ascii="Consolas" w:hAnsi="Consolas"/>
           <w:sz w:val="17"/>
         </w:rPr>
-        <w:t xml:space="preserve">eviceFileEvents`</w:t>
+        <w:t xml:space="preserve">DeviceFileEvents</w:t>
       </w:r>
       <w:r>
         <w:t xml:space="preserve"> contains file-creation/modification telemetry when Defender for Endpoint supplies those records. I would use the actual schema available in the tenant rather than assume every field is populated.</w:t>
@@ -32447,7 +32447,7 @@
           <w:rFonts w:ascii="Consolas" w:hAnsi="Consolas"/>
           <w:sz w:val="17"/>
         </w:rPr>
-        <w:t xml:space="preserve">eviceNetworkEvents`</w:t>
+        <w:t xml:space="preserve">DeviceNetworkEvents</w:t>
       </w:r>
       <w:r>
         <w:t xml:space="preserve"> and </w:t>
@@ -32457,7 +32457,7 @@
           <w:rFonts w:ascii="Consolas" w:hAnsi="Consolas"/>
           <w:sz w:val="17"/>
         </w:rPr>
-        <w:t xml:space="preserve">eviceFileEvents`</w:t>
+        <w:t xml:space="preserve">DeviceFileEvents</w:t>
       </w:r>
       <w:r>
         <w:t xml:space="preserve"> where available, Microsoft Sentinel, Splunk or Wazuh, Sysmon where configured, DNS/proxy/firewall telemetry, file reputation/sandboxing tools according to organisational policy.</w:t>
@@ -33285,7 +33285,7 @@
           <w:rFonts w:ascii="Consolas" w:hAnsi="Consolas"/>
           <w:sz w:val="17"/>
         </w:rPr>
-        <w:t xml:space="preserve">eviceProcessEvents`</w:t>
+        <w:t xml:space="preserve">DeviceProcessEvents</w:t>
       </w:r>
       <w:r>
         <w:t xml:space="preserve">, </w:t>
@@ -33295,7 +33295,7 @@
           <w:rFonts w:ascii="Consolas" w:hAnsi="Consolas"/>
           <w:sz w:val="17"/>
         </w:rPr>
-        <w:t xml:space="preserve">eviceNetworkEvents`</w:t>
+        <w:t xml:space="preserve">DeviceNetworkEvents</w:t>
       </w:r>
       <w:r>
         <w:t xml:space="preserve">, </w:t>
@@ -33305,7 +33305,7 @@
           <w:rFonts w:ascii="Consolas" w:hAnsi="Consolas"/>
           <w:sz w:val="17"/>
         </w:rPr>
-        <w:t xml:space="preserve">eviceFileEvents`</w:t>
+        <w:t xml:space="preserve">DeviceFileEvents</w:t>
       </w:r>
       <w:r>
         <w:t xml:space="preserve"> where useful, Microsoft Sentinel, PowerShell/Windows telemetry, DNS/proxy/firewall logs and EDR.</w:t>
@@ -34210,7 +34210,7 @@
           <w:rFonts w:ascii="Consolas" w:hAnsi="Consolas"/>
           <w:sz w:val="17"/>
         </w:rPr>
-        <w:t xml:space="preserve">utoMatedService`</w:t>
+        <w:t xml:space="preserve">AutoMatedService</w:t>
       </w:r>
       <w:r>
         <w:t xml:space="preserve"> and SubjectDomainName is populated.</w:t>
@@ -34375,7 +34375,7 @@
           <w:rFonts w:ascii="Consolas" w:hAnsi="Consolas"/>
           <w:sz w:val="17"/>
         </w:rPr>
-        <w:t xml:space="preserve">ecurityEvent`</w:t>
+        <w:t xml:space="preserve">SecurityEvent</w:t>
       </w:r>
       <w:r>
         <w:t xml:space="preserve">, Windows Security logs, Active Directory, Defender for Endpoint or another EDR, identity telemetry, Splunk/Wazuh and change-management records.</w:t>
@@ -35073,7 +35073,7 @@
           <w:rFonts w:ascii="Consolas" w:hAnsi="Consolas"/>
           <w:sz w:val="17"/>
         </w:rPr>
-        <w:t xml:space="preserve">owershell.exe`</w:t>
+        <w:t xml:space="preserve">powershell.exe</w:t>
       </w:r>
       <w:r>
         <w:t xml:space="preserve"> on a finance workstation. I would inspect the creator/parent process, account, path and command line if available. PowerShell launched interactively by an authorised administrator during a documented maintenance window may be legitimate. PowerShell spawned by Word with encoded or download-oriented arguments, followed by an outbound connection and unknown child process, would justify urgent investigation and likely escalation.</w:t>
@@ -35342,7 +35342,7 @@
           <w:rFonts w:ascii="Consolas" w:hAnsi="Consolas"/>
           <w:sz w:val="17"/>
         </w:rPr>
-        <w:t xml:space="preserve">eviceProcessEvents`</w:t>
+        <w:t xml:space="preserve">DeviceProcessEvents</w:t>
       </w:r>
       <w:r>
         <w:t xml:space="preserve"> table for process events where </w:t>
@@ -35352,7 +35352,7 @@
           <w:rFonts w:ascii="Consolas" w:hAnsi="Consolas"/>
           <w:sz w:val="17"/>
         </w:rPr>
-        <w:t xml:space="preserve">ileName`</w:t>
+        <w:t xml:space="preserve">FileName</w:t>
       </w:r>
       <w:r>
         <w:t xml:space="preserve"> case-insensitively equals </w:t>
@@ -35362,7 +35362,7 @@
           <w:rFonts w:ascii="Consolas" w:hAnsi="Consolas"/>
           <w:sz w:val="17"/>
         </w:rPr>
-        <w:t xml:space="preserve">owershell.exe`</w:t>
+        <w:t xml:space="preserve">powershell.exe</w:t>
       </w:r>
       <w:r>
         <w:t xml:space="preserve">. It then returns selected investigation fields: time, device, account, process name, the PowerShell command line, initiating process name and SHA1, ordered newest first.</w:t>
@@ -35380,7 +35380,7 @@
           <w:rFonts w:ascii="Consolas" w:hAnsi="Consolas"/>
           <w:sz w:val="17"/>
         </w:rPr>
-        <w:t xml:space="preserve">rocessCommandLine`</w:t>
+        <w:t xml:space="preserve">ProcessCommandLine</w:t>
       </w:r>
       <w:r>
         <w:t xml:space="preserve"> as the command line used to create the new process and </w:t>
@@ -35390,7 +35390,7 @@
           <w:rFonts w:ascii="Consolas" w:hAnsi="Consolas"/>
           <w:sz w:val="17"/>
         </w:rPr>
-        <w:t xml:space="preserve">nitiatingProcessFileName`</w:t>
+        <w:t xml:space="preserve">InitiatingProcessFileName</w:t>
       </w:r>
       <w:r>
         <w:t xml:space="preserve"> as the process file that initiated the event. </w:t>
@@ -35400,7 +35400,7 @@
           <w:rFonts w:ascii="Consolas" w:hAnsi="Consolas"/>
           <w:sz w:val="17"/>
         </w:rPr>
-        <w:t xml:space="preserve">HA1`</w:t>
+        <w:t xml:space="preserve">SHA1</w:t>
       </w:r>
       <w:r>
         <w:t xml:space="preserve"> identifies the file involved in the recorded action when populated. However, the query does not prove malicious PowerShell. PowerShell is a legitimate administrative and automation tool, and MITRE ATT&amp;CK T1059.001 describes how adversaries may abuse it for execution. The analyst must distinguish normal administration from abuse using context.</w:t>
@@ -35418,7 +35418,7 @@
           <w:rFonts w:ascii="Consolas" w:hAnsi="Consolas"/>
           <w:sz w:val="17"/>
         </w:rPr>
-        <w:t xml:space="preserve">owershell.exe`</w:t>
+        <w:t xml:space="preserve">powershell.exe</w:t>
       </w:r>
       <w:r>
         <w:t xml:space="preserve">, so this exact query is useful but not a complete PowerShell-abuse detector.</w:t>
@@ -35436,7 +35436,7 @@
           <w:rFonts w:ascii="Consolas" w:hAnsi="Consolas"/>
           <w:sz w:val="17"/>
         </w:rPr>
-        <w:t xml:space="preserve">owershell.exe`</w:t>
+        <w:t xml:space="preserve">powershell.exe</w:t>
       </w:r>
       <w:r>
         <w:t xml:space="preserve"> process events are present. Hypothesis: one or more executions may represent PowerShell abuse. Confirmed malicious activity requires command/context and correlated endpoint/network evidence.</w:t>
@@ -35463,7 +35463,7 @@
           <w:rFonts w:ascii="Consolas" w:hAnsi="Consolas"/>
           <w:sz w:val="17"/>
         </w:rPr>
-        <w:t xml:space="preserve">INWORD.EXE`</w:t>
+        <w:t xml:space="preserve">WINWORD.EXE</w:t>
       </w:r>
       <w:r>
         <w:t xml:space="preserve"> initiating </w:t>
@@ -35473,7 +35473,7 @@
           <w:rFonts w:ascii="Consolas" w:hAnsi="Consolas"/>
           <w:sz w:val="17"/>
         </w:rPr>
-        <w:t xml:space="preserve">owershell.exe`</w:t>
+        <w:t xml:space="preserve">powershell.exe</w:t>
       </w:r>
       <w:r>
         <w:t xml:space="preserve"> for a standard user, followed shortly by network activity to a newly observed external domain. I would inspect the complete command line, originating document/email context, child processes, file changes and related </w:t>
@@ -35483,7 +35483,7 @@
           <w:rFonts w:ascii="Consolas" w:hAnsi="Consolas"/>
           <w:sz w:val="17"/>
         </w:rPr>
-        <w:t xml:space="preserve">eviceNetworkEvents`</w:t>
+        <w:t xml:space="preserve">DeviceNetworkEvents</w:t>
       </w:r>
       <w:r>
         <w:t xml:space="preserve">. If the command retrieves and executes attacker-controlled content, that becomes strong evidence of malicious execution and should be escalated under the incident playbook.</w:t>
@@ -35510,7 +35510,7 @@
           <w:rFonts w:ascii="Consolas" w:hAnsi="Consolas"/>
           <w:sz w:val="17"/>
         </w:rPr>
-        <w:t xml:space="preserve">imestamp`</w:t>
+        <w:t xml:space="preserve">Timestamp</w:t>
       </w:r>
       <w:r>
         <w:t xml:space="preserve">, </w:t>
@@ -35520,7 +35520,7 @@
           <w:rFonts w:ascii="Consolas" w:hAnsi="Consolas"/>
           <w:sz w:val="17"/>
         </w:rPr>
-        <w:t xml:space="preserve">eviceName`</w:t>
+        <w:t xml:space="preserve">DeviceName</w:t>
       </w:r>
       <w:r>
         <w:t xml:space="preserve"> and </w:t>
@@ -35530,7 +35530,7 @@
           <w:rFonts w:ascii="Consolas" w:hAnsi="Consolas"/>
           <w:sz w:val="17"/>
         </w:rPr>
-        <w:t xml:space="preserve">ccountName`</w:t>
+        <w:t xml:space="preserve">AccountName</w:t>
       </w:r>
     </w:p>
     <w:p>
@@ -35545,7 +35545,7 @@
           <w:rFonts w:ascii="Consolas" w:hAnsi="Consolas"/>
           <w:sz w:val="17"/>
         </w:rPr>
-        <w:t xml:space="preserve">rocessCommandLine`</w:t>
+        <w:t xml:space="preserve">ProcessCommandLine</w:t>
       </w:r>
     </w:p>
     <w:p>
@@ -35560,7 +35560,7 @@
           <w:rFonts w:ascii="Consolas" w:hAnsi="Consolas"/>
           <w:sz w:val="17"/>
         </w:rPr>
-        <w:t xml:space="preserve">nitiatingProcessFileName`</w:t>
+        <w:t xml:space="preserve">InitiatingProcessFileName</w:t>
       </w:r>
       <w:r>
         <w:t xml:space="preserve"> and broader process tree</w:t>
@@ -35602,7 +35602,7 @@
           <w:rFonts w:ascii="Consolas" w:hAnsi="Consolas"/>
           <w:sz w:val="17"/>
         </w:rPr>
-        <w:t xml:space="preserve">emoteIP`</w:t>
+        <w:t xml:space="preserve">RemoteIP</w:t>
       </w:r>
       <w:r>
         <w:t xml:space="preserve">/</w:t>
@@ -35612,7 +35612,7 @@
           <w:rFonts w:ascii="Consolas" w:hAnsi="Consolas"/>
           <w:sz w:val="17"/>
         </w:rPr>
-        <w:t xml:space="preserve">emoteUrl`</w:t>
+        <w:t xml:space="preserve">RemoteUrl</w:t>
       </w:r>
       <w:r>
         <w:t xml:space="preserve"> where correlated</w:t>
@@ -35671,7 +35671,7 @@
           <w:rFonts w:ascii="Consolas" w:hAnsi="Consolas"/>
           <w:sz w:val="17"/>
         </w:rPr>
-        <w:t xml:space="preserve">eviceProcessEvents`</w:t>
+        <w:t xml:space="preserve">DeviceProcessEvents</w:t>
       </w:r>
       <w:r>
         <w:t xml:space="preserve">, </w:t>
@@ -35681,7 +35681,7 @@
           <w:rFonts w:ascii="Consolas" w:hAnsi="Consolas"/>
           <w:sz w:val="17"/>
         </w:rPr>
-        <w:t xml:space="preserve">eviceNetworkEvents`</w:t>
+        <w:t xml:space="preserve">DeviceNetworkEvents</w:t>
       </w:r>
       <w:r>
         <w:t xml:space="preserve">), Microsoft Sentinel, Defender for Endpoint device timeline, PowerShell logs, Windows Security/Sysmon, DNS/proxy/firewall logs, email-security telemetry and threat intelligence.</w:t>
@@ -35708,7 +35708,7 @@
           <w:rFonts w:ascii="Consolas" w:hAnsi="Consolas"/>
           <w:sz w:val="17"/>
         </w:rPr>
-        <w:t xml:space="preserve">owershell.exe`</w:t>
+        <w:t xml:space="preserve">powershell.exe</w:t>
       </w:r>
       <w:r>
         <w:t xml:space="preserve"> process events and exposes useful context, but PowerShell is dual-use. I would investigate the parent process, command line, user, child processes and network activity, and I would not call it malicious simply because PowerShell appears.”</w:t>
@@ -35785,7 +35785,7 @@
           <w:rFonts w:ascii="Consolas" w:hAnsi="Consolas"/>
           <w:sz w:val="17"/>
         </w:rPr>
-        <w:t xml:space="preserve">INWORD.EXE`</w:t>
+        <w:t xml:space="preserve">WINWORD.EXE</w:t>
       </w:r>
       <w:r>
         <w:t xml:space="preserve"> spawning </w:t>
@@ -35795,7 +35795,7 @@
           <w:rFonts w:ascii="Consolas" w:hAnsi="Consolas"/>
           <w:sz w:val="17"/>
         </w:rPr>
-        <w:t xml:space="preserve">owershell.exe`</w:t>
+        <w:t xml:space="preserve">powershell.exe</w:t>
       </w:r>
       <w:r>
         <w:t xml:space="preserve"> on a user's laptop. The command line is encoded, and minutes later the endpoint connects to an unfamiliar external IP. As a Tier 1 analyst, how would you triage this and decide whether to isolate the device?</w:t>
@@ -35863,7 +35863,7 @@
           <w:rFonts w:ascii="Consolas" w:hAnsi="Consolas"/>
           <w:sz w:val="17"/>
         </w:rPr>
-        <w:t xml:space="preserve">eviceNetworkEvents`</w:t>
+        <w:t xml:space="preserve">DeviceNetworkEvents</w:t>
       </w:r>
       <w:r>
         <w:t xml:space="preserve"> ties the PowerShell/descendant activity to the destination, and the user confirms they were not performing administrative work. I would document the timeline and indicators, check whether the same email or indicators affected other users/devices, and follow the incident playbook for urgent containment and escalation. If authorised, device isolation can reduce further network activity while Defender continues monitoring; if not authorised, I would request it immediately from the responder who holds that permission.</w:t>
@@ -36011,7 +36011,7 @@
           <w:rFonts w:ascii="Consolas" w:hAnsi="Consolas"/>
           <w:sz w:val="17"/>
         </w:rPr>
-        <w:t xml:space="preserve">eviceProcessEvents`</w:t>
+        <w:t xml:space="preserve">DeviceProcessEvents</w:t>
       </w:r>
       <w:r>
         <w:t xml:space="preserve"> and </w:t>
@@ -36021,7 +36021,7 @@
           <w:rFonts w:ascii="Consolas" w:hAnsi="Consolas"/>
           <w:sz w:val="17"/>
         </w:rPr>
-        <w:t xml:space="preserve">eviceNetworkEvents`</w:t>
+        <w:t xml:space="preserve">DeviceNetworkEvents</w:t>
       </w:r>
       <w:r>
         <w:t xml:space="preserve">, Microsoft Sentinel, Windows Security Event 4688, Sysmon where deployed, PowerShell logs, Microsoft Defender for Office 365 or equivalent email security such as Proofpoint/Abnormal Security, DNS/proxy/firewall logs and threat-intelligence sources.</w:t>
@@ -36622,7 +36622,7 @@
           <w:rFonts w:ascii="Consolas" w:hAnsi="Consolas"/>
           <w:sz w:val="17"/>
         </w:rPr>
-        <w:t xml:space="preserve">rc_ip`</w:t>
+        <w:t xml:space="preserve">src_ip</w:t>
       </w:r>
       <w:r>
         <w:t xml:space="preserve">, </w:t>
@@ -36632,7 +36632,7 @@
           <w:rFonts w:ascii="Consolas" w:hAnsi="Consolas"/>
           <w:sz w:val="17"/>
         </w:rPr>
-        <w:t xml:space="preserve">ser`</w:t>
+        <w:t xml:space="preserve">user</w:t>
       </w:r>
       <w:r>
         <w:t xml:space="preserve"> and </w:t>
@@ -36642,7 +36642,7 @@
           <w:rFonts w:ascii="Consolas" w:hAnsi="Consolas"/>
           <w:sz w:val="17"/>
         </w:rPr>
-        <w:t xml:space="preserve">ction`</w:t>
+        <w:t xml:space="preserve">action</w:t>
       </w:r>
       <w:r>
         <w:t xml:space="preserve">. Explain what this SPL is trying to show and what it does not prove:</w:t>
@@ -36705,7 +36705,7 @@
           <w:rFonts w:ascii="Consolas" w:hAnsi="Consolas"/>
           <w:sz w:val="17"/>
         </w:rPr>
-        <w:t xml:space="preserve">ction`</w:t>
+        <w:t xml:space="preserve">action</w:t>
       </w:r>
       <w:r>
         <w:t xml:space="preserve"> is </w:t>
@@ -36715,7 +36715,7 @@
           <w:rFonts w:ascii="Consolas" w:hAnsi="Consolas"/>
           <w:sz w:val="17"/>
         </w:rPr>
-        <w:t xml:space="preserve">ailure`</w:t>
+        <w:t xml:space="preserve">failure</w:t>
       </w:r>
       <w:r>
         <w:t xml:space="preserve">. The </w:t>
@@ -36725,7 +36725,7 @@
           <w:rFonts w:ascii="Consolas" w:hAnsi="Consolas"/>
           <w:sz w:val="17"/>
         </w:rPr>
-        <w:t xml:space="preserve">tats`</w:t>
+        <w:t xml:space="preserve">stats</w:t>
       </w:r>
       <w:r>
         <w:t xml:space="preserve"> command then groups results by </w:t>
@@ -36735,7 +36735,7 @@
           <w:rFonts w:ascii="Consolas" w:hAnsi="Consolas"/>
           <w:sz w:val="17"/>
         </w:rPr>
-        <w:t xml:space="preserve">rc_ip`</w:t>
+        <w:t xml:space="preserve">src_ip</w:t>
       </w:r>
       <w:r>
         <w:t xml:space="preserve">, counts the failure events, calculates the distinct number of users targeted with </w:t>
@@ -36745,7 +36745,7 @@
           <w:rFonts w:ascii="Consolas" w:hAnsi="Consolas"/>
           <w:sz w:val="17"/>
         </w:rPr>
-        <w:t xml:space="preserve">c(user)`</w:t>
+        <w:t xml:space="preserve">dc(user)</w:t>
       </w:r>
       <w:r>
         <w:t xml:space="preserve">, and returns the observed user values. Finally, it sorts the results so sources targeting the greatest number of distinct users appear first.</w:t>
@@ -36763,7 +36763,7 @@
           <w:rFonts w:ascii="Consolas" w:hAnsi="Consolas"/>
           <w:sz w:val="17"/>
         </w:rPr>
-        <w:t xml:space="preserve">tats`</w:t>
+        <w:t xml:space="preserve">stats</w:t>
       </w:r>
       <w:r>
         <w:t xml:space="preserve"> as an aggregation command and </w:t>
@@ -36773,7 +36773,7 @@
           <w:rFonts w:ascii="Consolas" w:hAnsi="Consolas"/>
           <w:sz w:val="17"/>
         </w:rPr>
-        <w:t xml:space="preserve">c()`</w:t>
+        <w:t xml:space="preserve">dc()</w:t>
       </w:r>
       <w:r>
         <w:t xml:space="preserve">/</w:t>
@@ -36783,7 +36783,7 @@
           <w:rFonts w:ascii="Consolas" w:hAnsi="Consolas"/>
           <w:sz w:val="17"/>
         </w:rPr>
-        <w:t xml:space="preserve">istinct_count()`</w:t>
+        <w:t xml:space="preserve">distinct_count()</w:t>
       </w:r>
       <w:r>
         <w:t xml:space="preserve"> as returning the count of distinct values. The important qualification is that </w:t>
@@ -36793,7 +36793,7 @@
           <w:rFonts w:ascii="Consolas" w:hAnsi="Consolas"/>
           <w:sz w:val="17"/>
         </w:rPr>
-        <w:t xml:space="preserve">rc_ip`</w:t>
+        <w:t xml:space="preserve">src_ip</w:t>
       </w:r>
       <w:r>
         <w:t xml:space="preserve">, </w:t>
@@ -36803,7 +36803,7 @@
           <w:rFonts w:ascii="Consolas" w:hAnsi="Consolas"/>
           <w:sz w:val="17"/>
         </w:rPr>
-        <w:t xml:space="preserve">ser`</w:t>
+        <w:t xml:space="preserve">user</w:t>
       </w:r>
       <w:r>
         <w:t xml:space="preserve">, </w:t>
@@ -36813,7 +36813,7 @@
           <w:rFonts w:ascii="Consolas" w:hAnsi="Consolas"/>
           <w:sz w:val="17"/>
         </w:rPr>
-        <w:t xml:space="preserve">ction`</w:t>
+        <w:t xml:space="preserve">action</w:t>
       </w:r>
       <w:r>
         <w:t xml:space="preserve"> and even </w:t>
@@ -36823,7 +36823,7 @@
           <w:rFonts w:ascii="Consolas" w:hAnsi="Consolas"/>
           <w:sz w:val="17"/>
         </w:rPr>
-        <w:t xml:space="preserve">ndex=auth`</w:t>
+        <w:t xml:space="preserve">index=auth</w:t>
       </w:r>
       <w:r>
         <w:t xml:space="preserve"> are example normalised fields/index names for this interview artefact; real field names depend on the organisation's data model, add-ons and ingestion pipeline.</w:t>
@@ -36990,7 +36990,7 @@
           <w:rFonts w:ascii="Consolas" w:hAnsi="Consolas"/>
           <w:sz w:val="17"/>
         </w:rPr>
-        <w:t xml:space="preserve">tats`</w:t>
+        <w:t xml:space="preserve">stats</w:t>
       </w:r>
       <w:r>
         <w:t xml:space="preserve"> command: https://help.splunk.com/en/splunk-enterprise/spl-search-reference/9.2/search-commands/stats</w:t>
@@ -37008,7 +37008,7 @@
           <w:rFonts w:ascii="Consolas" w:hAnsi="Consolas"/>
           <w:sz w:val="17"/>
         </w:rPr>
-        <w:t xml:space="preserve">c()`</w:t>
+        <w:t xml:space="preserve">dc()</w:t>
       </w:r>
       <w:r>
         <w:t xml:space="preserve">/</w:t>
@@ -37018,7 +37018,7 @@
           <w:rFonts w:ascii="Consolas" w:hAnsi="Consolas"/>
           <w:sz w:val="17"/>
         </w:rPr>
-        <w:t xml:space="preserve">istinct_count()`</w:t>
+        <w:t xml:space="preserve">distinct_count()</w:t>
       </w:r>
       <w:r>
         <w:t xml:space="preserve"> as counting distinct field values: https://help.splunk.com/en/splunk-cloud-platform/search/spl2-search-reference/statistical-and-charting-functions/aggregate-functions</w:t>
@@ -37868,7 +37868,7 @@
           <w:rFonts w:ascii="Consolas" w:hAnsi="Consolas"/>
           <w:sz w:val="17"/>
         </w:rPr>
-        <w:t xml:space="preserve">mailEvents`</w:t>
+        <w:t xml:space="preserve">EmailEvents</w:t>
       </w:r>
       <w:r>
         <w:t xml:space="preserve"> table for inbound email events recorded in the last 24 hours.</w:t>
@@ -37886,7 +37886,7 @@
           <w:rFonts w:ascii="Consolas" w:hAnsi="Consolas"/>
           <w:sz w:val="17"/>
         </w:rPr>
-        <w:t xml:space="preserve">enderFromAddress`</w:t>
+        <w:t xml:space="preserve">SenderFromAddress</w:t>
       </w:r>
       <w:r>
         <w:t xml:space="preserve">), the last detected relaying mail server's IPv4 address (</w:t>
@@ -37896,7 +37896,7 @@
           <w:rFonts w:ascii="Consolas" w:hAnsi="Consolas"/>
           <w:sz w:val="17"/>
         </w:rPr>
-        <w:t xml:space="preserve">enderIPv4`</w:t>
+        <w:t xml:space="preserve">SenderIPv4</w:t>
       </w:r>
       <w:r>
         <w:t xml:space="preserve">) and </w:t>
@@ -37906,7 +37906,7 @@
           <w:rFonts w:ascii="Consolas" w:hAnsi="Consolas"/>
           <w:sz w:val="17"/>
         </w:rPr>
-        <w:t xml:space="preserve">eliveryAction`</w:t>
+        <w:t xml:space="preserve">DeliveryAction</w:t>
       </w:r>
       <w:r>
         <w:t xml:space="preserve">. For each group, </w:t>
@@ -37916,7 +37916,7 @@
           <w:rFonts w:ascii="Consolas" w:hAnsi="Consolas"/>
           <w:sz w:val="17"/>
         </w:rPr>
-        <w:t xml:space="preserve">ount()`</w:t>
+        <w:t xml:space="preserve">count()</w:t>
       </w:r>
       <w:r>
         <w:t xml:space="preserve"> gives the number of matching email-event records and </w:t>
@@ -37926,7 +37926,7 @@
           <w:rFonts w:ascii="Consolas" w:hAnsi="Consolas"/>
           <w:sz w:val="17"/>
         </w:rPr>
-        <w:t xml:space="preserve">count(RecipientEmailAddress)`</w:t>
+        <w:t xml:space="preserve">dcount(RecipientEmailAddress)</w:t>
       </w:r>
       <w:r>
         <w:t xml:space="preserve"> gives an approximate distinct count of recipients. It then orders the results so groups reaching the most distinct recipients appear first.</w:t>
@@ -37952,7 +37952,7 @@
           <w:rFonts w:ascii="Consolas" w:hAnsi="Consolas"/>
           <w:sz w:val="17"/>
         </w:rPr>
-        <w:t xml:space="preserve">enderIPv4`</w:t>
+        <w:t xml:space="preserve">SenderIPv4</w:t>
       </w:r>
       <w:r>
         <w:t xml:space="preserve"> is mail-relay context rather than automatically the attacker's endpoint IP.</w:t>
@@ -37979,7 +37979,7 @@
           <w:rFonts w:ascii="Consolas" w:hAnsi="Consolas"/>
           <w:sz w:val="17"/>
         </w:rPr>
-        <w:t xml:space="preserve">mailUrlInfo`</w:t>
+        <w:t xml:space="preserve">EmailUrlInfo</w:t>
       </w:r>
       <w:r>
         <w:t xml:space="preserve"> using </w:t>
@@ -37989,7 +37989,7 @@
           <w:rFonts w:ascii="Consolas" w:hAnsi="Consolas"/>
           <w:sz w:val="17"/>
         </w:rPr>
-        <w:t xml:space="preserve">etworkMessageId`</w:t>
+        <w:t xml:space="preserve">NetworkMessageId</w:t>
       </w:r>
       <w:r>
         <w:t xml:space="preserve">, review sender/domain context, and determine whether recipients clicked or whether post-delivery remediation occurred.</w:t>
@@ -38449,7 +38449,7 @@
           <w:rFonts w:ascii="Consolas" w:hAnsi="Consolas"/>
           <w:sz w:val="17"/>
         </w:rPr>
-        <w:t xml:space="preserve">mailEvents`</w:t>
+        <w:t xml:space="preserve">EmailEvents</w:t>
       </w:r>
       <w:r>
         <w:t xml:space="preserve"> fields including </w:t>
@@ -38459,7 +38459,7 @@
           <w:rFonts w:ascii="Consolas" w:hAnsi="Consolas"/>
           <w:sz w:val="17"/>
         </w:rPr>
-        <w:t xml:space="preserve">imestamp`</w:t>
+        <w:t xml:space="preserve">Timestamp</w:t>
       </w:r>
       <w:r>
         <w:t xml:space="preserve">, </w:t>
@@ -38469,7 +38469,7 @@
           <w:rFonts w:ascii="Consolas" w:hAnsi="Consolas"/>
           <w:sz w:val="17"/>
         </w:rPr>
-        <w:t xml:space="preserve">etworkMessageId`</w:t>
+        <w:t xml:space="preserve">NetworkMessageId</w:t>
       </w:r>
       <w:r>
         <w:t xml:space="preserve">, </w:t>
@@ -38479,7 +38479,7 @@
           <w:rFonts w:ascii="Consolas" w:hAnsi="Consolas"/>
           <w:sz w:val="17"/>
         </w:rPr>
-        <w:t xml:space="preserve">enderFromAddress`</w:t>
+        <w:t xml:space="preserve">SenderFromAddress</w:t>
       </w:r>
       <w:r>
         <w:t xml:space="preserve">, </w:t>
@@ -38489,7 +38489,7 @@
           <w:rFonts w:ascii="Consolas" w:hAnsi="Consolas"/>
           <w:sz w:val="17"/>
         </w:rPr>
-        <w:t xml:space="preserve">enderMailFromAddress`</w:t>
+        <w:t xml:space="preserve">SenderMailFromAddress</w:t>
       </w:r>
       <w:r>
         <w:t xml:space="preserve">, </w:t>
@@ -38499,7 +38499,7 @@
           <w:rFonts w:ascii="Consolas" w:hAnsi="Consolas"/>
           <w:sz w:val="17"/>
         </w:rPr>
-        <w:t xml:space="preserve">enderIPv4`</w:t>
+        <w:t xml:space="preserve">SenderIPv4</w:t>
       </w:r>
       <w:r>
         <w:t xml:space="preserve">, </w:t>
@@ -38509,7 +38509,7 @@
           <w:rFonts w:ascii="Consolas" w:hAnsi="Consolas"/>
           <w:sz w:val="17"/>
         </w:rPr>
-        <w:t xml:space="preserve">ecipientEmailAddress`</w:t>
+        <w:t xml:space="preserve">RecipientEmailAddress</w:t>
       </w:r>
       <w:r>
         <w:t xml:space="preserve">, </w:t>
@@ -38519,7 +38519,7 @@
           <w:rFonts w:ascii="Consolas" w:hAnsi="Consolas"/>
           <w:sz w:val="17"/>
         </w:rPr>
-        <w:t xml:space="preserve">mailDirection`</w:t>
+        <w:t xml:space="preserve">EmailDirection</w:t>
       </w:r>
       <w:r>
         <w:t xml:space="preserve">, </w:t>
@@ -38529,7 +38529,7 @@
           <w:rFonts w:ascii="Consolas" w:hAnsi="Consolas"/>
           <w:sz w:val="17"/>
         </w:rPr>
-        <w:t xml:space="preserve">eliveryAction`</w:t>
+        <w:t xml:space="preserve">DeliveryAction</w:t>
       </w:r>
       <w:r>
         <w:t xml:space="preserve">, </w:t>
@@ -38539,7 +38539,7 @@
           <w:rFonts w:ascii="Consolas" w:hAnsi="Consolas"/>
           <w:sz w:val="17"/>
         </w:rPr>
-        <w:t xml:space="preserve">eliveryLocation`</w:t>
+        <w:t xml:space="preserve">DeliveryLocation</w:t>
       </w:r>
       <w:r>
         <w:t xml:space="preserve">, </w:t>
@@ -38549,7 +38549,7 @@
           <w:rFonts w:ascii="Consolas" w:hAnsi="Consolas"/>
           <w:sz w:val="17"/>
         </w:rPr>
-        <w:t xml:space="preserve">hreatTypes`</w:t>
+        <w:t xml:space="preserve">ThreatTypes</w:t>
       </w:r>
       <w:r>
         <w:t xml:space="preserve"> and </w:t>
@@ -38559,7 +38559,7 @@
           <w:rFonts w:ascii="Consolas" w:hAnsi="Consolas"/>
           <w:sz w:val="17"/>
         </w:rPr>
-        <w:t xml:space="preserve">etectionMethods`</w:t>
+        <w:t xml:space="preserve">DetectionMethods</w:t>
       </w:r>
       <w:r>
         <w:t xml:space="preserve">.</w:t>
@@ -38577,7 +38577,7 @@
           <w:rFonts w:ascii="Consolas" w:hAnsi="Consolas"/>
           <w:sz w:val="17"/>
         </w:rPr>
-        <w:t xml:space="preserve">mailUrlInfo`</w:t>
+        <w:t xml:space="preserve">EmailUrlInfo</w:t>
       </w:r>
       <w:r>
         <w:t xml:space="preserve"> as containing URLs from emails/attachments and </w:t>
@@ -38587,7 +38587,7 @@
           <w:rFonts w:ascii="Consolas" w:hAnsi="Consolas"/>
           <w:sz w:val="17"/>
         </w:rPr>
-        <w:t xml:space="preserve">etworkMessageId`</w:t>
+        <w:t xml:space="preserve">NetworkMessageId</w:t>
       </w:r>
       <w:r>
         <w:t xml:space="preserve"> for correlation with the associated email.</w:t>
@@ -38605,7 +38605,7 @@
           <w:rFonts w:ascii="Consolas" w:hAnsi="Consolas"/>
           <w:sz w:val="17"/>
         </w:rPr>
-        <w:t xml:space="preserve">mailPostDeliveryEvents`</w:t>
+        <w:t xml:space="preserve">EmailPostDeliveryEvents</w:t>
       </w:r>
       <w:r>
         <w:t xml:space="preserve"> as containing post-delivery actions, including manual remediation and ZAP actions, when Defender for Office 365 provides the data.</w:t>
@@ -42004,7 +42004,7 @@
           <w:rFonts w:ascii="Consolas" w:hAnsi="Consolas"/>
           <w:sz w:val="17"/>
         </w:rPr>
-        <w:t xml:space="preserve">shd`</w:t>
+        <w:t xml:space="preserve">sshd</w:t>
       </w:r>
       <w:r>
         <w:t xml:space="preserve"> accepts remote connections and supports authentication methods including passwords and public keys. SSH commonly uses TCP port 22, but a server may be configured to listen on another port. A successful SSH authentication is not proof of compromise, and an open port 22 does not prove anyone logged in.</w:t>
@@ -42163,7 +42163,7 @@
           <w:rFonts w:ascii="Consolas" w:hAnsi="Consolas"/>
           <w:sz w:val="17"/>
         </w:rPr>
-        <w:t xml:space="preserve">ournalctl`</w:t>
+        <w:t xml:space="preserve">journalctl</w:t>
       </w:r>
       <w:r>
         <w:t xml:space="preserve">), </w:t>
@@ -42173,7 +42173,7 @@
           <w:rFonts w:ascii="Consolas" w:hAnsi="Consolas"/>
           <w:sz w:val="17"/>
         </w:rPr>
-        <w:t xml:space="preserve">var/log/auth.log`</w:t>
+        <w:t xml:space="preserve">/var/log/auth.log</w:t>
       </w:r>
       <w:r>
         <w:t xml:space="preserve"> where configured, sudo event logs, auditd/EDR, Wazuh, Splunk, Sentinel, bastion/VPN and firewall logs.</w:t>
@@ -42243,7 +42243,7 @@
           <w:rFonts w:ascii="Consolas" w:hAnsi="Consolas"/>
           <w:sz w:val="17"/>
         </w:rPr>
-        <w:t xml:space="preserve">var/log/auth.log`</w:t>
+        <w:t xml:space="preserve">/var/log/auth.log</w:t>
       </w:r>
       <w:r>
         <w:t xml:space="preserve"> or Windows-style universal Event IDs. On a systemd-based Ubuntu server I could inspect the SSH service journal, for example:</w:t>
@@ -42270,7 +42270,7 @@
           <w:rFonts w:ascii="Consolas" w:hAnsi="Consolas"/>
           <w:sz w:val="17"/>
         </w:rPr>
-        <w:t xml:space="preserve">ournalctl`</w:t>
+        <w:t xml:space="preserve">journalctl</w:t>
       </w:r>
       <w:r>
         <w:t xml:space="preserve"> reads the systemd journal; </w:t>
@@ -42280,7 +42280,7 @@
           <w:rFonts w:ascii="Consolas" w:hAnsi="Consolas"/>
           <w:sz w:val="17"/>
         </w:rPr>
-        <w:t xml:space="preserve">u`</w:t>
+        <w:t xml:space="preserve">-u</w:t>
       </w:r>
       <w:r>
         <w:t xml:space="preserve"> filters to a unit and </w:t>
@@ -42290,7 +42290,7 @@
           <w:rFonts w:ascii="Consolas" w:hAnsi="Consolas"/>
           <w:sz w:val="17"/>
         </w:rPr>
-        <w:t xml:space="preserve">-since`</w:t>
+        <w:t xml:space="preserve">--since</w:t>
       </w:r>
       <w:r>
         <w:t xml:space="preserve">/</w:t>
@@ -42300,7 +42300,7 @@
           <w:rFonts w:ascii="Consolas" w:hAnsi="Consolas"/>
           <w:sz w:val="17"/>
         </w:rPr>
-        <w:t xml:space="preserve">-until`</w:t>
+        <w:t xml:space="preserve">--until</w:t>
       </w:r>
       <w:r>
         <w:t xml:space="preserve"> select a time window. Ubuntu documents </w:t>
@@ -42310,7 +42310,7 @@
           <w:rFonts w:ascii="Consolas" w:hAnsi="Consolas"/>
           <w:sz w:val="17"/>
         </w:rPr>
-        <w:t xml:space="preserve">sh.service`</w:t>
+        <w:t xml:space="preserve">ssh.service</w:t>
       </w:r>
       <w:r>
         <w:t xml:space="preserve"> for OpenSSH. The service name and log availability must be checked on the actual host. On some Ubuntu deployments, authentication events are also in </w:t>
@@ -42320,7 +42320,7 @@
           <w:rFonts w:ascii="Consolas" w:hAnsi="Consolas"/>
           <w:sz w:val="17"/>
         </w:rPr>
-        <w:t xml:space="preserve">var/log/auth.log`</w:t>
+        <w:t xml:space="preserve">/var/log/auth.log</w:t>
       </w:r>
       <w:r>
         <w:t xml:space="preserve"> when syslog is configured. I would inspect centrally forwarded logs when available.</w:t>
@@ -42477,7 +42477,7 @@
           <w:rFonts w:ascii="Consolas" w:hAnsi="Consolas"/>
           <w:sz w:val="17"/>
         </w:rPr>
-        <w:t xml:space="preserve">ournalctl`</w:t>
+        <w:t xml:space="preserve">journalctl</w:t>
       </w:r>
       <w:r>
         <w:t xml:space="preserve">, sshd and sudo logs, </w:t>
@@ -42487,7 +42487,7 @@
           <w:rFonts w:ascii="Consolas" w:hAnsi="Consolas"/>
           <w:sz w:val="17"/>
         </w:rPr>
-        <w:t xml:space="preserve">var/log/auth.log`</w:t>
+        <w:t xml:space="preserve">/var/log/auth.log</w:t>
       </w:r>
       <w:r>
         <w:t xml:space="preserve"> where present, auditd, Wazuh FIM, Splunk, Sentinel, EDR, bastion/VPN and change-management records.</w:t>
@@ -42602,7 +42602,7 @@
           <w:rFonts w:ascii="Consolas" w:hAnsi="Consolas"/>
           <w:sz w:val="17"/>
         </w:rPr>
-        <w:t xml:space="preserve">dmin`</w:t>
+        <w:t xml:space="preserve">admin</w:t>
       </w:r>
       <w:r>
         <w:t xml:space="preserve"> from documentation IP </w:t>
@@ -42612,7 +42612,7 @@
           <w:rFonts w:ascii="Consolas" w:hAnsi="Consolas"/>
           <w:sz w:val="17"/>
         </w:rPr>
-        <w:t xml:space="preserve">03.0.113.47`</w:t>
+        <w:t xml:space="preserve">203.0.113.47</w:t>
       </w:r>
       <w:r>
         <w:t xml:space="preserve">. The second records successful public-key authentication to the </w:t>
@@ -42622,7 +42622,7 @@
           <w:rFonts w:ascii="Consolas" w:hAnsi="Consolas"/>
           <w:sz w:val="17"/>
         </w:rPr>
-        <w:t xml:space="preserve">eploy`</w:t>
+        <w:t xml:space="preserve">deploy</w:t>
       </w:r>
       <w:r>
         <w:t xml:space="preserve"> account from the same source IP. The third shows a sudo event in which </w:t>
@@ -42632,7 +42632,7 @@
           <w:rFonts w:ascii="Consolas" w:hAnsi="Consolas"/>
           <w:sz w:val="17"/>
         </w:rPr>
-        <w:t xml:space="preserve">eploy`</w:t>
+        <w:t xml:space="preserve">deploy</w:t>
       </w:r>
       <w:r>
         <w:t xml:space="preserve"> invoked </w:t>
@@ -42642,7 +42642,7 @@
           <w:rFonts w:ascii="Consolas" w:hAnsi="Consolas"/>
           <w:sz w:val="17"/>
         </w:rPr>
-        <w:t xml:space="preserve">usr/bin/id`</w:t>
+        <w:t xml:space="preserve">/usr/bin/id</w:t>
       </w:r>
       <w:r>
         <w:t xml:space="preserve"> as root, according to the simulated sudo log. The different usernames and authentication methods matter: </w:t>
@@ -42669,7 +42669,7 @@
           <w:rFonts w:ascii="Consolas" w:hAnsi="Consolas"/>
           <w:sz w:val="17"/>
         </w:rPr>
-        <w:t xml:space="preserve">eploy`</w:t>
+        <w:t xml:space="preserve">deploy</w:t>
       </w:r>
       <w:r>
         <w:t xml:space="preserve"> is authorised for SSH and sudo, whether the public key fingerprint matches approved key inventory, whether the source IP is an expected jump/deployment host, and what other host activity occurred. I would confirm sudo outcome and the relationship between session and process using additional evidence; an invocation log alone does not prove every downstream action.</w:t>
@@ -42863,7 +42863,7 @@
           <w:rFonts w:ascii="Consolas" w:hAnsi="Consolas"/>
           <w:sz w:val="17"/>
         </w:rPr>
-        <w:t xml:space="preserve">eploy`</w:t>
+        <w:t xml:space="preserve">deploy</w:t>
       </w:r>
       <w:r>
         <w:t xml:space="preserve"> from an unfamiliar source. Minutes later sudo is used, and file-integrity monitoring reports a modification to </w:t>
@@ -42873,7 +42873,7 @@
           <w:rFonts w:ascii="Consolas" w:hAnsi="Consolas"/>
           <w:sz w:val="17"/>
         </w:rPr>
-        <w:t xml:space="preserve">home/deploy/.ssh/authorized_keys`</w:t>
+        <w:t xml:space="preserve">/home/deploy/.ssh/authorized_keys</w:t>
       </w:r>
       <w:r>
         <w:t xml:space="preserve">. How would you triage it as Tier 1, and would you isolate the server?</w:t>
@@ -42909,7 +42909,7 @@
           <w:rFonts w:ascii="Consolas" w:hAnsi="Consolas"/>
           <w:sz w:val="17"/>
         </w:rPr>
-        <w:t xml:space="preserve">uthorized_keys`</w:t>
+        <w:t xml:space="preserve">authorized_keys</w:t>
       </w:r>
       <w:r>
         <w:t xml:space="preserve"> to maintain access. However, the file can also be changed legitimately during key rotation or deployment; the event chain is not automatically confirmed compromise.</w:t>
@@ -42935,7 +42935,7 @@
           <w:rFonts w:ascii="Consolas" w:hAnsi="Consolas"/>
           <w:sz w:val="17"/>
         </w:rPr>
-        <w:t xml:space="preserve">uthorized_keys`</w:t>
+        <w:t xml:space="preserve">authorized_keys</w:t>
       </w:r>
       <w:r>
         <w:t xml:space="preserve"> files and SSH configuration changes, and scope other hosts accessed by the same source or account.</w:t>
@@ -42959,7 +42959,7 @@
           <w:rFonts w:ascii="Consolas" w:hAnsi="Consolas"/>
           <w:sz w:val="17"/>
         </w:rPr>
-        <w:t xml:space="preserve">uthorized_keys`</w:t>
+        <w:t xml:space="preserve">authorized_keys</w:t>
       </w:r>
       <w:r>
         <w:t xml:space="preserve"> modification occurred in sequence.  </w:t>
@@ -43028,7 +43028,7 @@
           <w:rFonts w:ascii="Consolas" w:hAnsi="Consolas"/>
           <w:sz w:val="17"/>
         </w:rPr>
-        <w:t xml:space="preserve">uthorized_keys`</w:t>
+        <w:t xml:space="preserve">authorized_keys</w:t>
       </w:r>
       <w:r>
         <w:t xml:space="preserve"> after the unusual login. I would raise a likely SSH persistence incident, preserve the evidence, scope other systems and seek authorised containment immediately.</w:t>
@@ -43087,7 +43087,7 @@
           <w:rFonts w:ascii="Consolas" w:hAnsi="Consolas"/>
           <w:sz w:val="17"/>
         </w:rPr>
-        <w:t xml:space="preserve">uthorized_keys`</w:t>
+        <w:t xml:space="preserve">authorized_keys</w:t>
       </w:r>
       <w:r>
         <w:t xml:space="preserve"> changes, SSH config and other privileged accounts</w:t>
@@ -43164,7 +43164,7 @@
           <w:rFonts w:ascii="Consolas" w:hAnsi="Consolas"/>
           <w:sz w:val="17"/>
         </w:rPr>
-        <w:t xml:space="preserve">sh.service`</w:t>
+        <w:t xml:space="preserve">ssh.service</w:t>
       </w:r>
       <w:r>
         <w:t xml:space="preserve"> journal inspection: https://ubuntu.com/server/docs/how-to/security/openssh-server/</w:t>
@@ -43182,7 +43182,7 @@
           <w:rFonts w:ascii="Consolas" w:hAnsi="Consolas"/>
           <w:sz w:val="17"/>
         </w:rPr>
-        <w:t xml:space="preserve">ournalctl`</w:t>
+        <w:t xml:space="preserve">journalctl</w:t>
       </w:r>
       <w:r>
         <w:t xml:space="preserve"> manual documents </w:t>
@@ -43192,7 +43192,7 @@
           <w:rFonts w:ascii="Consolas" w:hAnsi="Consolas"/>
           <w:sz w:val="17"/>
         </w:rPr>
-        <w:t xml:space="preserve">u/--unit`</w:t>
+        <w:t xml:space="preserve">-u/--unit</w:t>
       </w:r>
       <w:r>
         <w:t xml:space="preserve">, </w:t>
@@ -43202,7 +43202,7 @@
           <w:rFonts w:ascii="Consolas" w:hAnsi="Consolas"/>
           <w:sz w:val="17"/>
         </w:rPr>
-        <w:t xml:space="preserve">-since`</w:t>
+        <w:t xml:space="preserve">--since</w:t>
       </w:r>
       <w:r>
         <w:t xml:space="preserve">, </w:t>
@@ -43212,7 +43212,7 @@
           <w:rFonts w:ascii="Consolas" w:hAnsi="Consolas"/>
           <w:sz w:val="17"/>
         </w:rPr>
-        <w:t xml:space="preserve">-until`</w:t>
+        <w:t xml:space="preserve">--until</w:t>
       </w:r>
       <w:r>
         <w:t xml:space="preserve"> and </w:t>
@@ -43222,7 +43222,7 @@
           <w:rFonts w:ascii="Consolas" w:hAnsi="Consolas"/>
           <w:sz w:val="17"/>
         </w:rPr>
-        <w:t xml:space="preserve">-no-pager`</w:t>
+        <w:t xml:space="preserve">--no-pager</w:t>
       </w:r>
       <w:r>
         <w:t xml:space="preserve">; available records and privileges vary by system: https://man7.org/linux/man-pages/man1/journalctl.1.html</w:t>
@@ -43240,7 +43240,7 @@
           <w:rFonts w:ascii="Consolas" w:hAnsi="Consolas"/>
           <w:sz w:val="17"/>
         </w:rPr>
-        <w:t xml:space="preserve">udoers`</w:t>
+        <w:t xml:space="preserve">sudoers</w:t>
       </w:r>
       <w:r>
         <w:t xml:space="preserve"> manual documents configurable sudo event logging, command-invocation fields and separate optional I/O/subcommand logging: https://man7.org/linux/man-pages/man5/sudoers.5.html</w:t>
@@ -43258,7 +43258,7 @@
           <w:rFonts w:ascii="Consolas" w:hAnsi="Consolas"/>
           <w:sz w:val="17"/>
         </w:rPr>
-        <w:t xml:space="preserve">shd(8)`</w:t>
+        <w:t xml:space="preserve">sshd(8)</w:t>
       </w:r>
       <w:r>
         <w:t xml:space="preserve"> manual documents </w:t>
@@ -43268,7 +43268,7 @@
           <w:rFonts w:ascii="Consolas" w:hAnsi="Consolas"/>
           <w:sz w:val="17"/>
         </w:rPr>
-        <w:t xml:space="preserve">uthorized_keys`</w:t>
+        <w:t xml:space="preserve">authorized_keys</w:t>
       </w:r>
       <w:r>
         <w:t xml:space="preserve"> and key formats: https://man7.org/linux/man-pages/man8/sshd.8.html</w:t>
@@ -43302,7 +43302,7 @@
           <w:rFonts w:ascii="Consolas" w:hAnsi="Consolas"/>
           <w:sz w:val="17"/>
         </w:rPr>
-        <w:t xml:space="preserve">03.0.113.47`</w:t>
+        <w:t xml:space="preserve">203.0.113.47</w:t>
       </w:r>
       <w:r>
         <w:t xml:space="preserve"> is used as a documentation address. No actual incident or observed log is asserted.</w:t>
@@ -43367,7 +43367,7 @@
     </w:p>
     <w:sectPr>
       <w:pgSz w:w="11906" w:h="16838"/>
-      <w:pgMar w:top="1000" w:right="1050" w:bottom="1000" w:left="1050" w:header="480" w:footer="480" w:gutter="0"/>
+      <w:pgMar w:top="950" w:right="950" w:bottom="950" w:left="950" w:header="450" w:footer="450"/>
     </w:sectPr>
   </w:body>
 </w:document>

</xml_diff>